<commit_message>
Add targeted security resume and A4 layout
</commit_message>
<xml_diff>
--- a/Job-Resume/Resume.docx
+++ b/Job-Resume/Resume.docx
@@ -72,6 +72,7 @@
     <w:p>
       <w:pPr>
         <w:spacing w:before="0" w:after="70"/>
+        <w:jc w:val="both"/>
       </w:pPr>
       <w:r>
         <w:rPr>
@@ -84,6 +85,7 @@
     <w:p>
       <w:pPr>
         <w:spacing w:before="0" w:after="70"/>
+        <w:jc w:val="both"/>
       </w:pPr>
       <w:r>
         <w:rPr>
@@ -96,6 +98,7 @@
     <w:p>
       <w:pPr>
         <w:spacing w:before="0" w:after="70"/>
+        <w:jc w:val="both"/>
       </w:pPr>
       <w:r>
         <w:rPr>
@@ -121,6 +124,7 @@
     <w:p>
       <w:pPr>
         <w:spacing w:before="0" w:after="50"/>
+        <w:jc w:val="both"/>
       </w:pPr>
       <w:r>
         <w:rPr>
@@ -133,6 +137,7 @@
     <w:p>
       <w:pPr>
         <w:spacing w:before="0" w:after="50"/>
+        <w:jc w:val="both"/>
       </w:pPr>
       <w:r>
         <w:rPr>
@@ -145,6 +150,7 @@
     <w:p>
       <w:pPr>
         <w:spacing w:before="0" w:after="50"/>
+        <w:jc w:val="both"/>
       </w:pPr>
       <w:r>
         <w:rPr>
@@ -157,6 +163,7 @@
     <w:p>
       <w:pPr>
         <w:spacing w:before="0" w:after="50"/>
+        <w:jc w:val="both"/>
       </w:pPr>
       <w:r>
         <w:rPr>
@@ -169,6 +176,7 @@
     <w:p>
       <w:pPr>
         <w:spacing w:before="0" w:after="50"/>
+        <w:jc w:val="both"/>
       </w:pPr>
       <w:r>
         <w:rPr>
@@ -181,6 +189,7 @@
     <w:p>
       <w:pPr>
         <w:spacing w:before="0" w:after="50"/>
+        <w:jc w:val="both"/>
       </w:pPr>
       <w:r>
         <w:rPr>
@@ -193,6 +202,7 @@
     <w:p>
       <w:pPr>
         <w:spacing w:before="0" w:after="50"/>
+        <w:jc w:val="both"/>
       </w:pPr>
       <w:r>
         <w:rPr>
@@ -205,6 +215,7 @@
     <w:p>
       <w:pPr>
         <w:spacing w:before="0" w:after="50"/>
+        <w:jc w:val="both"/>
       </w:pPr>
       <w:r>
         <w:rPr>
@@ -217,6 +228,7 @@
     <w:p>
       <w:pPr>
         <w:spacing w:before="0" w:after="50"/>
+        <w:jc w:val="both"/>
       </w:pPr>
       <w:r>
         <w:rPr>
@@ -229,6 +241,7 @@
     <w:p>
       <w:pPr>
         <w:spacing w:before="0" w:after="50"/>
+        <w:jc w:val="both"/>
       </w:pPr>
       <w:r>
         <w:rPr>
@@ -241,6 +254,7 @@
     <w:p>
       <w:pPr>
         <w:spacing w:before="0" w:after="50"/>
+        <w:jc w:val="both"/>
       </w:pPr>
       <w:r>
         <w:rPr>
@@ -253,6 +267,7 @@
     <w:p>
       <w:pPr>
         <w:spacing w:before="0" w:after="50"/>
+        <w:jc w:val="both"/>
       </w:pPr>
       <w:r>
         <w:rPr>
@@ -265,6 +280,7 @@
     <w:p>
       <w:pPr>
         <w:spacing w:before="0" w:after="50"/>
+        <w:jc w:val="both"/>
       </w:pPr>
       <w:r>
         <w:rPr>
@@ -303,6 +319,7 @@
     <w:p>
       <w:pPr>
         <w:spacing w:before="0" w:after="70"/>
+        <w:jc w:val="both"/>
       </w:pPr>
       <w:r>
         <w:rPr>
@@ -315,6 +332,7 @@
     <w:p>
       <w:pPr>
         <w:spacing w:before="0" w:after="50"/>
+        <w:jc w:val="both"/>
       </w:pPr>
       <w:r>
         <w:rPr>
@@ -327,6 +345,7 @@
     <w:p>
       <w:pPr>
         <w:spacing w:before="0" w:after="50"/>
+        <w:jc w:val="both"/>
       </w:pPr>
       <w:r>
         <w:rPr>
@@ -339,6 +358,7 @@
     <w:p>
       <w:pPr>
         <w:spacing w:before="0" w:after="50"/>
+        <w:jc w:val="both"/>
       </w:pPr>
       <w:r>
         <w:rPr>
@@ -364,6 +384,7 @@
     <w:p>
       <w:pPr>
         <w:spacing w:before="0" w:after="70"/>
+        <w:jc w:val="both"/>
       </w:pPr>
       <w:r>
         <w:rPr>
@@ -376,6 +397,7 @@
     <w:p>
       <w:pPr>
         <w:spacing w:before="0" w:after="50"/>
+        <w:jc w:val="both"/>
       </w:pPr>
       <w:r>
         <w:rPr>
@@ -388,6 +410,7 @@
     <w:p>
       <w:pPr>
         <w:spacing w:before="0" w:after="50"/>
+        <w:jc w:val="both"/>
       </w:pPr>
       <w:r>
         <w:rPr>
@@ -413,6 +436,7 @@
     <w:p>
       <w:pPr>
         <w:spacing w:before="0" w:after="70"/>
+        <w:jc w:val="both"/>
       </w:pPr>
       <w:r>
         <w:rPr>
@@ -425,6 +449,7 @@
     <w:p>
       <w:pPr>
         <w:spacing w:before="0" w:after="50"/>
+        <w:jc w:val="both"/>
       </w:pPr>
       <w:r>
         <w:rPr>
@@ -437,6 +462,7 @@
     <w:p>
       <w:pPr>
         <w:spacing w:before="0" w:after="50"/>
+        <w:jc w:val="both"/>
       </w:pPr>
       <w:r>
         <w:rPr>
@@ -449,6 +475,7 @@
     <w:p>
       <w:pPr>
         <w:spacing w:before="0" w:after="50"/>
+        <w:jc w:val="both"/>
       </w:pPr>
       <w:r>
         <w:rPr>
@@ -474,6 +501,7 @@
     <w:p>
       <w:pPr>
         <w:spacing w:before="0" w:after="70"/>
+        <w:jc w:val="both"/>
       </w:pPr>
       <w:r>
         <w:rPr>
@@ -486,6 +514,7 @@
     <w:p>
       <w:pPr>
         <w:spacing w:before="0" w:after="50"/>
+        <w:jc w:val="both"/>
       </w:pPr>
       <w:r>
         <w:rPr>
@@ -498,6 +527,7 @@
     <w:p>
       <w:pPr>
         <w:spacing w:before="0" w:after="50"/>
+        <w:jc w:val="both"/>
       </w:pPr>
       <w:r>
         <w:rPr>
@@ -510,6 +540,7 @@
     <w:p>
       <w:pPr>
         <w:spacing w:before="0" w:after="50"/>
+        <w:jc w:val="both"/>
       </w:pPr>
       <w:r>
         <w:rPr>
@@ -535,6 +566,7 @@
     <w:p>
       <w:pPr>
         <w:spacing w:before="0" w:after="50"/>
+        <w:jc w:val="both"/>
       </w:pPr>
       <w:r>
         <w:rPr>
@@ -547,6 +579,7 @@
     <w:p>
       <w:pPr>
         <w:spacing w:before="0" w:after="50"/>
+        <w:jc w:val="both"/>
       </w:pPr>
       <w:r>
         <w:rPr>
@@ -559,6 +592,7 @@
     <w:p>
       <w:pPr>
         <w:spacing w:before="0" w:after="50"/>
+        <w:jc w:val="both"/>
       </w:pPr>
       <w:r>
         <w:rPr>
@@ -571,6 +605,7 @@
     <w:p>
       <w:pPr>
         <w:spacing w:before="0" w:after="50"/>
+        <w:jc w:val="both"/>
       </w:pPr>
       <w:r>
         <w:rPr>
@@ -596,6 +631,7 @@
     <w:p>
       <w:pPr>
         <w:spacing w:before="0" w:after="50"/>
+        <w:jc w:val="both"/>
       </w:pPr>
       <w:r>
         <w:rPr>
@@ -608,6 +644,7 @@
     <w:p>
       <w:pPr>
         <w:spacing w:before="0" w:after="50"/>
+        <w:jc w:val="both"/>
       </w:pPr>
       <w:r>
         <w:rPr>
@@ -633,6 +670,7 @@
     <w:p>
       <w:pPr>
         <w:spacing w:before="0" w:after="50"/>
+        <w:jc w:val="both"/>
       </w:pPr>
       <w:r>
         <w:rPr>
@@ -645,6 +683,7 @@
     <w:p>
       <w:pPr>
         <w:spacing w:before="0" w:after="50"/>
+        <w:jc w:val="both"/>
       </w:pPr>
       <w:r>
         <w:rPr>
@@ -670,6 +709,7 @@
     <w:p>
       <w:pPr>
         <w:spacing w:before="0" w:after="50"/>
+        <w:jc w:val="both"/>
       </w:pPr>
       <w:r>
         <w:rPr>
@@ -682,6 +722,7 @@
     <w:p>
       <w:pPr>
         <w:spacing w:before="0" w:after="50"/>
+        <w:jc w:val="both"/>
       </w:pPr>
       <w:r>
         <w:rPr>
@@ -694,6 +735,7 @@
     <w:p>
       <w:pPr>
         <w:spacing w:before="0" w:after="50"/>
+        <w:jc w:val="both"/>
       </w:pPr>
       <w:r>
         <w:rPr>
@@ -706,6 +748,7 @@
     <w:p>
       <w:pPr>
         <w:spacing w:before="0" w:after="50"/>
+        <w:jc w:val="both"/>
       </w:pPr>
       <w:r>
         <w:rPr>
@@ -718,6 +761,7 @@
     <w:p>
       <w:pPr>
         <w:spacing w:before="0" w:after="50"/>
+        <w:jc w:val="both"/>
       </w:pPr>
       <w:r>
         <w:rPr>
@@ -728,8 +772,8 @@
       </w:r>
     </w:p>
     <w:sectPr>
-      <w:pgSz w:w="12240" w:h="15840"/>
-      <w:pgMar w:top="540" w:right="1080" w:bottom="864" w:left="1080" w:header="708" w:footer="708" w:gutter="0"/>
+      <w:pgSz w:w="11906" w:h="16838"/>
+      <w:pgMar w:top="900" w:right="900" w:bottom="900" w:left="900" w:header="360" w:footer="360" w:gutter="0"/>
       <w:cols w:space="720"/>
       <w:docGrid w:linePitch="360"/>
     </w:sectPr>

</xml_diff>